<commit_message>
docs: capitalise [REDACTED] and change font to Arial
</commit_message>
<xml_diff>
--- a/secrets_of_the_universe.docx
+++ b/secrets_of_the_universe.docx
@@ -19,11 +19,11 @@
     <w:p>
       <w:r>
         <w:rPr>
-          <w:rFonts w:ascii="Times New Roman" w:hAnsi="Times New Roman"/>
+          <w:rFonts w:ascii="Arial" w:hAnsi="Arial"/>
           <w:color w:val="FF0000"/>
           <w:sz w:val="50"/>
         </w:rPr>
-        <w:t>[redacted]</w:t>
+        <w:t>[REDACTED]</w:t>
       </w:r>
     </w:p>
     <w:sectPr>

</xml_diff>